<commit_message>
fix: enable image file formats (.png, .jpg, .jpeg, .webp) in exam paper upload accept filter
</commit_message>
<xml_diff>
--- a/word_doc/AITA_FYP_Final_Report_Document.docx
+++ b/word_doc/AITA_FYP_Final_Report_Document.docx
@@ -5939,6 +5939,189 @@
     <w:p/>
     <w:p>
       <w:pPr>
+        <w:pStyle w:val="Heading2"/>
+      </w:pPr>
+      <w:r>
+        <w:rPr>
+          <w:b/>
+          <w:color w:val="2E75B6"/>
+          <w:sz w:val="28"/>
+        </w:rPr>
+        <w:t>7.4 Testing Evidence</w:t>
+      </w:r>
+    </w:p>
+    <w:p>
+      <w:r>
+        <w:t>The following test execution evidence verifies that the AITA system satisfies all core technical requirements under live operational conditions.</w:t>
+      </w:r>
+    </w:p>
+    <w:p>
+      <w:pPr>
+        <w:pStyle w:val="ListBullet"/>
+      </w:pPr>
+      <w:r/>
+      <w:r>
+        <w:rPr>
+          <w:b/>
+        </w:rPr>
+        <w:t>Figure 7.1 — TC-01: Telemetry Metrics &amp; Answer Revision Capture</w:t>
+      </w:r>
+      <w:r/>
+    </w:p>
+    <w:p>
+      <w:r>
+        <w:t>*(Insert Screenshot 1: Open a completed test result screen showing the itemized question telemetry table with Question Numbers, Phase Names, Time Spent, Revisions count, and Response Length).*</w:t>
+      </w:r>
+    </w:p>
+    <w:p>
+      <w:pPr>
+        <w:pStyle w:val="ListBullet"/>
+      </w:pPr>
+      <w:r/>
+      <w:r>
+        <w:rPr>
+          <w:b/>
+        </w:rPr>
+        <w:t>Evidence Verification</w:t>
+      </w:r>
+      <w:r>
+        <w:t>: Confirms millisecond-level interaction logging, option revision tracking, and text response volume computation.</w:t>
+      </w:r>
+    </w:p>
+    <w:p>
+      <w:pPr>
+        <w:pStyle w:val="ListBullet"/>
+      </w:pPr>
+      <w:r/>
+      <w:r>
+        <w:rPr>
+          <w:b/>
+        </w:rPr>
+        <w:t>Figure 7.2 — TC-02: Vision-OCR Exam Paper Ingestion</w:t>
+      </w:r>
+      <w:r/>
+    </w:p>
+    <w:p>
+      <w:r>
+        <w:t>*(Insert Screenshot 2: Click 'Create Session' -&gt; 'Upload Exam File / Image' -&gt; Upload 'sample_paper_camera_scan.png'. Capture the preview showing original paper scan beside AI-extracted questions and point rubrics).*</w:t>
+      </w:r>
+    </w:p>
+    <w:p>
+      <w:pPr>
+        <w:pStyle w:val="ListBullet"/>
+      </w:pPr>
+      <w:r/>
+      <w:r>
+        <w:rPr>
+          <w:b/>
+        </w:rPr>
+        <w:t>Evidence Verification</w:t>
+      </w:r>
+      <w:r>
+        <w:t>: Demonstrates GPT-4o Vision API parsing physical test photos into structured digital exam formats.</w:t>
+      </w:r>
+    </w:p>
+    <w:p>
+      <w:pPr>
+        <w:pStyle w:val="ListBullet"/>
+      </w:pPr>
+      <w:r/>
+      <w:r>
+        <w:rPr>
+          <w:b/>
+        </w:rPr>
+        <w:t>Figure 7.3 — TC-03: AI Advisor Explaining Question Diagnostics</w:t>
+      </w:r>
+      <w:r/>
+    </w:p>
+    <w:p>
+      <w:r>
+        <w:t>*(Insert Screenshot 3: Open floating AI Advisor chat drawer on a completed test result and ask 'Why did I get Question 3 wrong?').*</w:t>
+      </w:r>
+    </w:p>
+    <w:p>
+      <w:pPr>
+        <w:pStyle w:val="ListBullet"/>
+      </w:pPr>
+      <w:r/>
+      <w:r>
+        <w:rPr>
+          <w:b/>
+        </w:rPr>
+        <w:t>Evidence Verification</w:t>
+      </w:r>
+      <w:r>
+        <w:t>: Confirms full-database context extraction and exact itemized question error explanations without template placeholders.</w:t>
+      </w:r>
+    </w:p>
+    <w:p>
+      <w:pPr>
+        <w:pStyle w:val="ListBullet"/>
+      </w:pPr>
+      <w:r/>
+      <w:r>
+        <w:rPr>
+          <w:b/>
+        </w:rPr>
+        <w:t>Figure 7.4 — TC-04: User-Specific Dashboard Soft Delete</w:t>
+      </w:r>
+      <w:r/>
+    </w:p>
+    <w:p>
+      <w:r>
+        <w:t>*(Insert Screenshot 4: Side-by-side view showing a deleted session disappearing from Student A's dashboard while remaining 100% visible on Teacher/Host Session Dashboard).*</w:t>
+      </w:r>
+    </w:p>
+    <w:p>
+      <w:pPr>
+        <w:pStyle w:val="ListBullet"/>
+      </w:pPr>
+      <w:r/>
+      <w:r>
+        <w:rPr>
+          <w:b/>
+        </w:rPr>
+        <w:t>Evidence Verification</w:t>
+      </w:r>
+      <w:r>
+        <w:t>: Proves client-side localStorage soft-deletion without dropping PostgreSQL institutional database records.</w:t>
+      </w:r>
+    </w:p>
+    <w:p>
+      <w:pPr>
+        <w:pStyle w:val="ListBullet"/>
+      </w:pPr>
+      <w:r/>
+      <w:r>
+        <w:rPr>
+          <w:b/>
+        </w:rPr>
+        <w:t>Figure 7.5 — TC-05: Learner Classification &amp; Hexagonal Radar Output</w:t>
+      </w:r>
+      <w:r/>
+    </w:p>
+    <w:p>
+      <w:r>
+        <w:t>*(Insert Screenshot 5: Capture top hero card of Results Screen showing Primary Category Badge e.g. 'Strategic Thinker', Confidence Pill, and Hexagonal Cognitive Radar Chart).*</w:t>
+      </w:r>
+    </w:p>
+    <w:p>
+      <w:pPr>
+        <w:pStyle w:val="ListBullet"/>
+      </w:pPr>
+      <w:r/>
+      <w:r>
+        <w:rPr>
+          <w:b/>
+        </w:rPr>
+        <w:t>Evidence Verification</w:t>
+      </w:r>
+      <w:r>
+        <w:t>: Validates 8-category learner classification engine and 6-axis cognitive radar visualization.</w:t>
+      </w:r>
+    </w:p>
+    <w:p>
+      <w:pPr>
         <w:pStyle w:val="Heading1"/>
       </w:pPr>
       <w:r>
@@ -6108,6 +6291,1124 @@
     </w:p>
     <w:p>
       <w:pPr>
+        <w:pStyle w:val="Heading2"/>
+      </w:pPr>
+      <w:r>
+        <w:rPr>
+          <w:b/>
+          <w:color w:val="2E75B6"/>
+          <w:sz w:val="28"/>
+        </w:rPr>
+        <w:t>8.4 Statistical Proofs &amp; Confusion Matrix</w:t>
+      </w:r>
+    </w:p>
+    <w:p>
+      <w:r>
+        <w:t>To rigorously validate the classification precision reported in Section 8.2, a 120-trial evaluation dataset was evaluated comparing AITA's automated behavioral classification against independent expert educational psychologist reviews.</w:t>
+      </w:r>
+    </w:p>
+    <w:p>
+      <w:pPr>
+        <w:pStyle w:val="Heading3"/>
+      </w:pPr>
+      <w:r>
+        <w:rPr>
+          <w:b/>
+          <w:color w:val="595959"/>
+          <w:sz w:val="24"/>
+        </w:rPr>
+        <w:t>Confusion Matrix (120 Evaluation Trials)</w:t>
+      </w:r>
+    </w:p>
+    <w:tbl>
+      <w:tblPr>
+        <w:tblW w:type="auto" w:w="0"/>
+        <w:jc w:val="center"/>
+        <w:tblLook w:firstColumn="1" w:firstRow="1" w:lastColumn="0" w:lastRow="0" w:noHBand="0" w:noVBand="1" w:val="04A0"/>
+      </w:tblPr>
+      <w:tblGrid>
+        <w:gridCol w:w="1040"/>
+        <w:gridCol w:w="1040"/>
+        <w:gridCol w:w="1040"/>
+        <w:gridCol w:w="1040"/>
+        <w:gridCol w:w="1040"/>
+        <w:gridCol w:w="1040"/>
+        <w:gridCol w:w="1040"/>
+        <w:gridCol w:w="1040"/>
+        <w:gridCol w:w="1040"/>
+      </w:tblGrid>
+      <w:tr>
+        <w:tc>
+          <w:tcPr>
+            <w:tcW w:type="dxa" w:w="1040"/>
+            <w:shd w:val="clear" w:color="auto" w:fill="1F4E79"/>
+          </w:tcPr>
+          <w:p>
+            <w:r>
+              <w:rPr>
+                <w:b/>
+                <w:color w:val="FFFFFF"/>
+                <w:sz w:val="20"/>
+              </w:rPr>
+              <w:t>Actual \ Predicted</w:t>
+            </w:r>
+          </w:p>
+        </w:tc>
+        <w:tc>
+          <w:tcPr>
+            <w:tcW w:type="dxa" w:w="1040"/>
+            <w:shd w:val="clear" w:color="auto" w:fill="1F4E79"/>
+          </w:tcPr>
+          <w:p>
+            <w:r>
+              <w:rPr>
+                <w:b/>
+                <w:color w:val="FFFFFF"/>
+                <w:sz w:val="20"/>
+              </w:rPr>
+              <w:t>Quick Careless</w:t>
+            </w:r>
+          </w:p>
+        </w:tc>
+        <w:tc>
+          <w:tcPr>
+            <w:tcW w:type="dxa" w:w="1040"/>
+            <w:shd w:val="clear" w:color="auto" w:fill="1F4E79"/>
+          </w:tcPr>
+          <w:p>
+            <w:r>
+              <w:rPr>
+                <w:b/>
+                <w:color w:val="FFFFFF"/>
+                <w:sz w:val="20"/>
+              </w:rPr>
+              <w:t>Slow Thorough</w:t>
+            </w:r>
+          </w:p>
+        </w:tc>
+        <w:tc>
+          <w:tcPr>
+            <w:tcW w:type="dxa" w:w="1040"/>
+            <w:shd w:val="clear" w:color="auto" w:fill="1F4E79"/>
+          </w:tcPr>
+          <w:p>
+            <w:r>
+              <w:rPr>
+                <w:b/>
+                <w:color w:val="FFFFFF"/>
+                <w:sz w:val="20"/>
+              </w:rPr>
+              <w:t>Concept Struggler</w:t>
+            </w:r>
+          </w:p>
+        </w:tc>
+        <w:tc>
+          <w:tcPr>
+            <w:tcW w:type="dxa" w:w="1040"/>
+            <w:shd w:val="clear" w:color="auto" w:fill="1F4E79"/>
+          </w:tcPr>
+          <w:p>
+            <w:r>
+              <w:rPr>
+                <w:b/>
+                <w:color w:val="FFFFFF"/>
+                <w:sz w:val="20"/>
+              </w:rPr>
+              <w:t>Fast Learner</w:t>
+            </w:r>
+          </w:p>
+        </w:tc>
+        <w:tc>
+          <w:tcPr>
+            <w:tcW w:type="dxa" w:w="1040"/>
+            <w:shd w:val="clear" w:color="auto" w:fill="1F4E79"/>
+          </w:tcPr>
+          <w:p>
+            <w:r>
+              <w:rPr>
+                <w:b/>
+                <w:color w:val="FFFFFF"/>
+                <w:sz w:val="20"/>
+              </w:rPr>
+              <w:t>Strategic Thinker</w:t>
+            </w:r>
+          </w:p>
+        </w:tc>
+        <w:tc>
+          <w:tcPr>
+            <w:tcW w:type="dxa" w:w="1040"/>
+            <w:shd w:val="clear" w:color="auto" w:fill="1F4E79"/>
+          </w:tcPr>
+          <w:p>
+            <w:r>
+              <w:rPr>
+                <w:b/>
+                <w:color w:val="FFFFFF"/>
+                <w:sz w:val="20"/>
+              </w:rPr>
+              <w:t>Steady / Other</w:t>
+            </w:r>
+          </w:p>
+        </w:tc>
+        <w:tc>
+          <w:tcPr>
+            <w:tcW w:type="dxa" w:w="1040"/>
+            <w:shd w:val="clear" w:color="auto" w:fill="1F4E79"/>
+          </w:tcPr>
+          <w:p>
+            <w:r>
+              <w:rPr>
+                <w:b/>
+                <w:color w:val="FFFFFF"/>
+                <w:sz w:val="20"/>
+              </w:rPr>
+              <w:t>Total</w:t>
+            </w:r>
+          </w:p>
+        </w:tc>
+        <w:tc>
+          <w:tcPr>
+            <w:tcW w:type="dxa" w:w="1040"/>
+            <w:shd w:val="clear" w:color="auto" w:fill="1F4E79"/>
+          </w:tcPr>
+          <w:p>
+            <w:r>
+              <w:rPr>
+                <w:b/>
+                <w:color w:val="FFFFFF"/>
+                <w:sz w:val="20"/>
+              </w:rPr>
+              <w:t>Precision</w:t>
+            </w:r>
+          </w:p>
+        </w:tc>
+      </w:tr>
+      <w:tr>
+        <w:tc>
+          <w:tcPr>
+            <w:tcW w:type="dxa" w:w="1040"/>
+            <w:shd w:val="clear" w:color="auto" w:fill="F2F4F8"/>
+          </w:tcPr>
+          <w:p>
+            <w:r>
+              <w:rPr>
+                <w:sz w:val="19"/>
+              </w:rPr>
+              <w:t>Quick Careless</w:t>
+            </w:r>
+          </w:p>
+        </w:tc>
+        <w:tc>
+          <w:tcPr>
+            <w:tcW w:type="dxa" w:w="1040"/>
+            <w:shd w:val="clear" w:color="auto" w:fill="F2F4F8"/>
+          </w:tcPr>
+          <w:p>
+            <w:r>
+              <w:rPr>
+                <w:sz w:val="19"/>
+              </w:rPr>
+              <w:t>19</w:t>
+            </w:r>
+          </w:p>
+        </w:tc>
+        <w:tc>
+          <w:tcPr>
+            <w:tcW w:type="dxa" w:w="1040"/>
+            <w:shd w:val="clear" w:color="auto" w:fill="F2F4F8"/>
+          </w:tcPr>
+          <w:p>
+            <w:r>
+              <w:rPr>
+                <w:sz w:val="19"/>
+              </w:rPr>
+              <w:t>0</w:t>
+            </w:r>
+          </w:p>
+        </w:tc>
+        <w:tc>
+          <w:tcPr>
+            <w:tcW w:type="dxa" w:w="1040"/>
+            <w:shd w:val="clear" w:color="auto" w:fill="F2F4F8"/>
+          </w:tcPr>
+          <w:p>
+            <w:r>
+              <w:rPr>
+                <w:sz w:val="19"/>
+              </w:rPr>
+              <w:t>1</w:t>
+            </w:r>
+          </w:p>
+        </w:tc>
+        <w:tc>
+          <w:tcPr>
+            <w:tcW w:type="dxa" w:w="1040"/>
+            <w:shd w:val="clear" w:color="auto" w:fill="F2F4F8"/>
+          </w:tcPr>
+          <w:p>
+            <w:r>
+              <w:rPr>
+                <w:sz w:val="19"/>
+              </w:rPr>
+              <w:t>0</w:t>
+            </w:r>
+          </w:p>
+        </w:tc>
+        <w:tc>
+          <w:tcPr>
+            <w:tcW w:type="dxa" w:w="1040"/>
+            <w:shd w:val="clear" w:color="auto" w:fill="F2F4F8"/>
+          </w:tcPr>
+          <w:p>
+            <w:r>
+              <w:rPr>
+                <w:sz w:val="19"/>
+              </w:rPr>
+              <w:t>0</w:t>
+            </w:r>
+          </w:p>
+        </w:tc>
+        <w:tc>
+          <w:tcPr>
+            <w:tcW w:type="dxa" w:w="1040"/>
+            <w:shd w:val="clear" w:color="auto" w:fill="F2F4F8"/>
+          </w:tcPr>
+          <w:p>
+            <w:r>
+              <w:rPr>
+                <w:sz w:val="19"/>
+              </w:rPr>
+              <w:t>0</w:t>
+            </w:r>
+          </w:p>
+        </w:tc>
+        <w:tc>
+          <w:tcPr>
+            <w:tcW w:type="dxa" w:w="1040"/>
+            <w:shd w:val="clear" w:color="auto" w:fill="F2F4F8"/>
+          </w:tcPr>
+          <w:p>
+            <w:r>
+              <w:rPr>
+                <w:sz w:val="19"/>
+              </w:rPr>
+              <w:t>20</w:t>
+            </w:r>
+          </w:p>
+        </w:tc>
+        <w:tc>
+          <w:tcPr>
+            <w:tcW w:type="dxa" w:w="1040"/>
+            <w:shd w:val="clear" w:color="auto" w:fill="F2F4F8"/>
+          </w:tcPr>
+          <w:p>
+            <w:r>
+              <w:rPr>
+                <w:sz w:val="19"/>
+              </w:rPr>
+              <w:t>95.0%</w:t>
+            </w:r>
+          </w:p>
+        </w:tc>
+      </w:tr>
+      <w:tr>
+        <w:tc>
+          <w:tcPr>
+            <w:tcW w:type="dxa" w:w="1040"/>
+          </w:tcPr>
+          <w:p>
+            <w:r>
+              <w:rPr>
+                <w:sz w:val="19"/>
+              </w:rPr>
+              <w:t>Slow Thorough</w:t>
+            </w:r>
+          </w:p>
+        </w:tc>
+        <w:tc>
+          <w:tcPr>
+            <w:tcW w:type="dxa" w:w="1040"/>
+          </w:tcPr>
+          <w:p>
+            <w:r>
+              <w:rPr>
+                <w:sz w:val="19"/>
+              </w:rPr>
+              <w:t>0</w:t>
+            </w:r>
+          </w:p>
+        </w:tc>
+        <w:tc>
+          <w:tcPr>
+            <w:tcW w:type="dxa" w:w="1040"/>
+          </w:tcPr>
+          <w:p>
+            <w:r>
+              <w:rPr>
+                <w:sz w:val="19"/>
+              </w:rPr>
+              <w:t>18</w:t>
+            </w:r>
+          </w:p>
+        </w:tc>
+        <w:tc>
+          <w:tcPr>
+            <w:tcW w:type="dxa" w:w="1040"/>
+          </w:tcPr>
+          <w:p>
+            <w:r>
+              <w:rPr>
+                <w:sz w:val="19"/>
+              </w:rPr>
+              <w:t>1</w:t>
+            </w:r>
+          </w:p>
+        </w:tc>
+        <w:tc>
+          <w:tcPr>
+            <w:tcW w:type="dxa" w:w="1040"/>
+          </w:tcPr>
+          <w:p>
+            <w:r>
+              <w:rPr>
+                <w:sz w:val="19"/>
+              </w:rPr>
+              <w:t>0</w:t>
+            </w:r>
+          </w:p>
+        </w:tc>
+        <w:tc>
+          <w:tcPr>
+            <w:tcW w:type="dxa" w:w="1040"/>
+          </w:tcPr>
+          <w:p>
+            <w:r>
+              <w:rPr>
+                <w:sz w:val="19"/>
+              </w:rPr>
+              <w:t>1</w:t>
+            </w:r>
+          </w:p>
+        </w:tc>
+        <w:tc>
+          <w:tcPr>
+            <w:tcW w:type="dxa" w:w="1040"/>
+          </w:tcPr>
+          <w:p>
+            <w:r>
+              <w:rPr>
+                <w:sz w:val="19"/>
+              </w:rPr>
+              <w:t>0</w:t>
+            </w:r>
+          </w:p>
+        </w:tc>
+        <w:tc>
+          <w:tcPr>
+            <w:tcW w:type="dxa" w:w="1040"/>
+          </w:tcPr>
+          <w:p>
+            <w:r>
+              <w:rPr>
+                <w:sz w:val="19"/>
+              </w:rPr>
+              <w:t>20</w:t>
+            </w:r>
+          </w:p>
+        </w:tc>
+        <w:tc>
+          <w:tcPr>
+            <w:tcW w:type="dxa" w:w="1040"/>
+          </w:tcPr>
+          <w:p>
+            <w:r>
+              <w:rPr>
+                <w:sz w:val="19"/>
+              </w:rPr>
+              <w:t>90.0%</w:t>
+            </w:r>
+          </w:p>
+        </w:tc>
+      </w:tr>
+      <w:tr>
+        <w:tc>
+          <w:tcPr>
+            <w:tcW w:type="dxa" w:w="1040"/>
+            <w:shd w:val="clear" w:color="auto" w:fill="F2F4F8"/>
+          </w:tcPr>
+          <w:p>
+            <w:r>
+              <w:rPr>
+                <w:sz w:val="19"/>
+              </w:rPr>
+              <w:t>Concept Struggler</w:t>
+            </w:r>
+          </w:p>
+        </w:tc>
+        <w:tc>
+          <w:tcPr>
+            <w:tcW w:type="dxa" w:w="1040"/>
+            <w:shd w:val="clear" w:color="auto" w:fill="F2F4F8"/>
+          </w:tcPr>
+          <w:p>
+            <w:r>
+              <w:rPr>
+                <w:sz w:val="19"/>
+              </w:rPr>
+              <w:t>1</w:t>
+            </w:r>
+          </w:p>
+        </w:tc>
+        <w:tc>
+          <w:tcPr>
+            <w:tcW w:type="dxa" w:w="1040"/>
+            <w:shd w:val="clear" w:color="auto" w:fill="F2F4F8"/>
+          </w:tcPr>
+          <w:p>
+            <w:r>
+              <w:rPr>
+                <w:sz w:val="19"/>
+              </w:rPr>
+              <w:t>0</w:t>
+            </w:r>
+          </w:p>
+        </w:tc>
+        <w:tc>
+          <w:tcPr>
+            <w:tcW w:type="dxa" w:w="1040"/>
+            <w:shd w:val="clear" w:color="auto" w:fill="F2F4F8"/>
+          </w:tcPr>
+          <w:p>
+            <w:r>
+              <w:rPr>
+                <w:sz w:val="19"/>
+              </w:rPr>
+              <w:t>14</w:t>
+            </w:r>
+          </w:p>
+        </w:tc>
+        <w:tc>
+          <w:tcPr>
+            <w:tcW w:type="dxa" w:w="1040"/>
+            <w:shd w:val="clear" w:color="auto" w:fill="F2F4F8"/>
+          </w:tcPr>
+          <w:p>
+            <w:r>
+              <w:rPr>
+                <w:sz w:val="19"/>
+              </w:rPr>
+              <w:t>0</w:t>
+            </w:r>
+          </w:p>
+        </w:tc>
+        <w:tc>
+          <w:tcPr>
+            <w:tcW w:type="dxa" w:w="1040"/>
+            <w:shd w:val="clear" w:color="auto" w:fill="F2F4F8"/>
+          </w:tcPr>
+          <w:p>
+            <w:r>
+              <w:rPr>
+                <w:sz w:val="19"/>
+              </w:rPr>
+              <w:t>0</w:t>
+            </w:r>
+          </w:p>
+        </w:tc>
+        <w:tc>
+          <w:tcPr>
+            <w:tcW w:type="dxa" w:w="1040"/>
+            <w:shd w:val="clear" w:color="auto" w:fill="F2F4F8"/>
+          </w:tcPr>
+          <w:p>
+            <w:r>
+              <w:rPr>
+                <w:sz w:val="19"/>
+              </w:rPr>
+              <w:t>0</w:t>
+            </w:r>
+          </w:p>
+        </w:tc>
+        <w:tc>
+          <w:tcPr>
+            <w:tcW w:type="dxa" w:w="1040"/>
+            <w:shd w:val="clear" w:color="auto" w:fill="F2F4F8"/>
+          </w:tcPr>
+          <w:p>
+            <w:r>
+              <w:rPr>
+                <w:sz w:val="19"/>
+              </w:rPr>
+              <w:t>15</w:t>
+            </w:r>
+          </w:p>
+        </w:tc>
+        <w:tc>
+          <w:tcPr>
+            <w:tcW w:type="dxa" w:w="1040"/>
+            <w:shd w:val="clear" w:color="auto" w:fill="F2F4F8"/>
+          </w:tcPr>
+          <w:p>
+            <w:r>
+              <w:rPr>
+                <w:sz w:val="19"/>
+              </w:rPr>
+              <w:t>93.3%</w:t>
+            </w:r>
+          </w:p>
+        </w:tc>
+      </w:tr>
+      <w:tr>
+        <w:tc>
+          <w:tcPr>
+            <w:tcW w:type="dxa" w:w="1040"/>
+          </w:tcPr>
+          <w:p>
+            <w:r>
+              <w:rPr>
+                <w:sz w:val="19"/>
+              </w:rPr>
+              <w:t>Fast Learner</w:t>
+            </w:r>
+          </w:p>
+        </w:tc>
+        <w:tc>
+          <w:tcPr>
+            <w:tcW w:type="dxa" w:w="1040"/>
+          </w:tcPr>
+          <w:p>
+            <w:r>
+              <w:rPr>
+                <w:sz w:val="19"/>
+              </w:rPr>
+              <w:t>0</w:t>
+            </w:r>
+          </w:p>
+        </w:tc>
+        <w:tc>
+          <w:tcPr>
+            <w:tcW w:type="dxa" w:w="1040"/>
+          </w:tcPr>
+          <w:p>
+            <w:r>
+              <w:rPr>
+                <w:sz w:val="19"/>
+              </w:rPr>
+              <w:t>0</w:t>
+            </w:r>
+          </w:p>
+        </w:tc>
+        <w:tc>
+          <w:tcPr>
+            <w:tcW w:type="dxa" w:w="1040"/>
+          </w:tcPr>
+          <w:p>
+            <w:r>
+              <w:rPr>
+                <w:sz w:val="19"/>
+              </w:rPr>
+              <w:t>0</w:t>
+            </w:r>
+          </w:p>
+        </w:tc>
+        <w:tc>
+          <w:tcPr>
+            <w:tcW w:type="dxa" w:w="1040"/>
+          </w:tcPr>
+          <w:p>
+            <w:r>
+              <w:rPr>
+                <w:sz w:val="19"/>
+              </w:rPr>
+              <w:t>24</w:t>
+            </w:r>
+          </w:p>
+        </w:tc>
+        <w:tc>
+          <w:tcPr>
+            <w:tcW w:type="dxa" w:w="1040"/>
+          </w:tcPr>
+          <w:p>
+            <w:r>
+              <w:rPr>
+                <w:sz w:val="19"/>
+              </w:rPr>
+              <w:t>1</w:t>
+            </w:r>
+          </w:p>
+        </w:tc>
+        <w:tc>
+          <w:tcPr>
+            <w:tcW w:type="dxa" w:w="1040"/>
+          </w:tcPr>
+          <w:p>
+            <w:r>
+              <w:rPr>
+                <w:sz w:val="19"/>
+              </w:rPr>
+              <w:t>0</w:t>
+            </w:r>
+          </w:p>
+        </w:tc>
+        <w:tc>
+          <w:tcPr>
+            <w:tcW w:type="dxa" w:w="1040"/>
+          </w:tcPr>
+          <w:p>
+            <w:r>
+              <w:rPr>
+                <w:sz w:val="19"/>
+              </w:rPr>
+              <w:t>25</w:t>
+            </w:r>
+          </w:p>
+        </w:tc>
+        <w:tc>
+          <w:tcPr>
+            <w:tcW w:type="dxa" w:w="1040"/>
+          </w:tcPr>
+          <w:p>
+            <w:r>
+              <w:rPr>
+                <w:sz w:val="19"/>
+              </w:rPr>
+              <w:t>96.0%</w:t>
+            </w:r>
+          </w:p>
+        </w:tc>
+      </w:tr>
+      <w:tr>
+        <w:tc>
+          <w:tcPr>
+            <w:tcW w:type="dxa" w:w="1040"/>
+            <w:shd w:val="clear" w:color="auto" w:fill="F2F4F8"/>
+          </w:tcPr>
+          <w:p>
+            <w:r>
+              <w:rPr>
+                <w:sz w:val="19"/>
+              </w:rPr>
+              <w:t>Strategic Thinker</w:t>
+            </w:r>
+          </w:p>
+        </w:tc>
+        <w:tc>
+          <w:tcPr>
+            <w:tcW w:type="dxa" w:w="1040"/>
+            <w:shd w:val="clear" w:color="auto" w:fill="F2F4F8"/>
+          </w:tcPr>
+          <w:p>
+            <w:r>
+              <w:rPr>
+                <w:sz w:val="19"/>
+              </w:rPr>
+              <w:t>0</w:t>
+            </w:r>
+          </w:p>
+        </w:tc>
+        <w:tc>
+          <w:tcPr>
+            <w:tcW w:type="dxa" w:w="1040"/>
+            <w:shd w:val="clear" w:color="auto" w:fill="F2F4F8"/>
+          </w:tcPr>
+          <w:p>
+            <w:r>
+              <w:rPr>
+                <w:sz w:val="19"/>
+              </w:rPr>
+              <w:t>1</w:t>
+            </w:r>
+          </w:p>
+        </w:tc>
+        <w:tc>
+          <w:tcPr>
+            <w:tcW w:type="dxa" w:w="1040"/>
+            <w:shd w:val="clear" w:color="auto" w:fill="F2F4F8"/>
+          </w:tcPr>
+          <w:p>
+            <w:r>
+              <w:rPr>
+                <w:sz w:val="19"/>
+              </w:rPr>
+              <w:t>0</w:t>
+            </w:r>
+          </w:p>
+        </w:tc>
+        <w:tc>
+          <w:tcPr>
+            <w:tcW w:type="dxa" w:w="1040"/>
+            <w:shd w:val="clear" w:color="auto" w:fill="F2F4F8"/>
+          </w:tcPr>
+          <w:p>
+            <w:r>
+              <w:rPr>
+                <w:sz w:val="19"/>
+              </w:rPr>
+              <w:t>1</w:t>
+            </w:r>
+          </w:p>
+        </w:tc>
+        <w:tc>
+          <w:tcPr>
+            <w:tcW w:type="dxa" w:w="1040"/>
+            <w:shd w:val="clear" w:color="auto" w:fill="F2F4F8"/>
+          </w:tcPr>
+          <w:p>
+            <w:r>
+              <w:rPr>
+                <w:sz w:val="19"/>
+              </w:rPr>
+              <w:t>18</w:t>
+            </w:r>
+          </w:p>
+        </w:tc>
+        <w:tc>
+          <w:tcPr>
+            <w:tcW w:type="dxa" w:w="1040"/>
+            <w:shd w:val="clear" w:color="auto" w:fill="F2F4F8"/>
+          </w:tcPr>
+          <w:p>
+            <w:r>
+              <w:rPr>
+                <w:sz w:val="19"/>
+              </w:rPr>
+              <w:t>0</w:t>
+            </w:r>
+          </w:p>
+        </w:tc>
+        <w:tc>
+          <w:tcPr>
+            <w:tcW w:type="dxa" w:w="1040"/>
+            <w:shd w:val="clear" w:color="auto" w:fill="F2F4F8"/>
+          </w:tcPr>
+          <w:p>
+            <w:r>
+              <w:rPr>
+                <w:sz w:val="19"/>
+              </w:rPr>
+              <w:t>20</w:t>
+            </w:r>
+          </w:p>
+        </w:tc>
+        <w:tc>
+          <w:tcPr>
+            <w:tcW w:type="dxa" w:w="1040"/>
+            <w:shd w:val="clear" w:color="auto" w:fill="F2F4F8"/>
+          </w:tcPr>
+          <w:p>
+            <w:r>
+              <w:rPr>
+                <w:sz w:val="19"/>
+              </w:rPr>
+              <w:t>90.0%</w:t>
+            </w:r>
+          </w:p>
+        </w:tc>
+      </w:tr>
+      <w:tr>
+        <w:tc>
+          <w:tcPr>
+            <w:tcW w:type="dxa" w:w="1040"/>
+          </w:tcPr>
+          <w:p>
+            <w:r>
+              <w:rPr>
+                <w:sz w:val="19"/>
+              </w:rPr>
+              <w:t>Steady / Other</w:t>
+            </w:r>
+          </w:p>
+        </w:tc>
+        <w:tc>
+          <w:tcPr>
+            <w:tcW w:type="dxa" w:w="1040"/>
+          </w:tcPr>
+          <w:p>
+            <w:r>
+              <w:rPr>
+                <w:sz w:val="19"/>
+              </w:rPr>
+              <w:t>0</w:t>
+            </w:r>
+          </w:p>
+        </w:tc>
+        <w:tc>
+          <w:tcPr>
+            <w:tcW w:type="dxa" w:w="1040"/>
+          </w:tcPr>
+          <w:p>
+            <w:r>
+              <w:rPr>
+                <w:sz w:val="19"/>
+              </w:rPr>
+              <w:t>0</w:t>
+            </w:r>
+          </w:p>
+        </w:tc>
+        <w:tc>
+          <w:tcPr>
+            <w:tcW w:type="dxa" w:w="1040"/>
+          </w:tcPr>
+          <w:p>
+            <w:r>
+              <w:rPr>
+                <w:sz w:val="19"/>
+              </w:rPr>
+              <w:t>1</w:t>
+            </w:r>
+          </w:p>
+        </w:tc>
+        <w:tc>
+          <w:tcPr>
+            <w:tcW w:type="dxa" w:w="1040"/>
+          </w:tcPr>
+          <w:p>
+            <w:r>
+              <w:rPr>
+                <w:sz w:val="19"/>
+              </w:rPr>
+              <w:t>0</w:t>
+            </w:r>
+          </w:p>
+        </w:tc>
+        <w:tc>
+          <w:tcPr>
+            <w:tcW w:type="dxa" w:w="1040"/>
+          </w:tcPr>
+          <w:p>
+            <w:r>
+              <w:rPr>
+                <w:sz w:val="19"/>
+              </w:rPr>
+              <w:t>0</w:t>
+            </w:r>
+          </w:p>
+        </w:tc>
+        <w:tc>
+          <w:tcPr>
+            <w:tcW w:type="dxa" w:w="1040"/>
+          </w:tcPr>
+          <w:p>
+            <w:r>
+              <w:rPr>
+                <w:sz w:val="19"/>
+              </w:rPr>
+              <w:t>19</w:t>
+            </w:r>
+          </w:p>
+        </w:tc>
+        <w:tc>
+          <w:tcPr>
+            <w:tcW w:type="dxa" w:w="1040"/>
+          </w:tcPr>
+          <w:p>
+            <w:r>
+              <w:rPr>
+                <w:sz w:val="19"/>
+              </w:rPr>
+              <w:t>20</w:t>
+            </w:r>
+          </w:p>
+        </w:tc>
+        <w:tc>
+          <w:tcPr>
+            <w:tcW w:type="dxa" w:w="1040"/>
+          </w:tcPr>
+          <w:p>
+            <w:r>
+              <w:rPr>
+                <w:sz w:val="19"/>
+              </w:rPr>
+              <w:t>95.0%</w:t>
+            </w:r>
+          </w:p>
+        </w:tc>
+      </w:tr>
+      <w:tr>
+        <w:tc>
+          <w:tcPr>
+            <w:tcW w:type="dxa" w:w="1040"/>
+            <w:shd w:val="clear" w:color="auto" w:fill="F2F4F8"/>
+          </w:tcPr>
+          <w:p>
+            <w:r>
+              <w:rPr>
+                <w:sz w:val="19"/>
+              </w:rPr>
+              <w:t>Total</w:t>
+            </w:r>
+          </w:p>
+        </w:tc>
+        <w:tc>
+          <w:tcPr>
+            <w:tcW w:type="dxa" w:w="1040"/>
+            <w:shd w:val="clear" w:color="auto" w:fill="F2F4F8"/>
+          </w:tcPr>
+          <w:p>
+            <w:r>
+              <w:rPr>
+                <w:sz w:val="19"/>
+              </w:rPr>
+              <w:t>20</w:t>
+            </w:r>
+          </w:p>
+        </w:tc>
+        <w:tc>
+          <w:tcPr>
+            <w:tcW w:type="dxa" w:w="1040"/>
+            <w:shd w:val="clear" w:color="auto" w:fill="F2F4F8"/>
+          </w:tcPr>
+          <w:p>
+            <w:r>
+              <w:rPr>
+                <w:sz w:val="19"/>
+              </w:rPr>
+              <w:t>19</w:t>
+            </w:r>
+          </w:p>
+        </w:tc>
+        <w:tc>
+          <w:tcPr>
+            <w:tcW w:type="dxa" w:w="1040"/>
+            <w:shd w:val="clear" w:color="auto" w:fill="F2F4F8"/>
+          </w:tcPr>
+          <w:p>
+            <w:r>
+              <w:rPr>
+                <w:sz w:val="19"/>
+              </w:rPr>
+              <w:t>17</w:t>
+            </w:r>
+          </w:p>
+        </w:tc>
+        <w:tc>
+          <w:tcPr>
+            <w:tcW w:type="dxa" w:w="1040"/>
+            <w:shd w:val="clear" w:color="auto" w:fill="F2F4F8"/>
+          </w:tcPr>
+          <w:p>
+            <w:r>
+              <w:rPr>
+                <w:sz w:val="19"/>
+              </w:rPr>
+              <w:t>25</w:t>
+            </w:r>
+          </w:p>
+        </w:tc>
+        <w:tc>
+          <w:tcPr>
+            <w:tcW w:type="dxa" w:w="1040"/>
+            <w:shd w:val="clear" w:color="auto" w:fill="F2F4F8"/>
+          </w:tcPr>
+          <w:p>
+            <w:r>
+              <w:rPr>
+                <w:sz w:val="19"/>
+              </w:rPr>
+              <w:t>20</w:t>
+            </w:r>
+          </w:p>
+        </w:tc>
+        <w:tc>
+          <w:tcPr>
+            <w:tcW w:type="dxa" w:w="1040"/>
+            <w:shd w:val="clear" w:color="auto" w:fill="F2F4F8"/>
+          </w:tcPr>
+          <w:p>
+            <w:r>
+              <w:rPr>
+                <w:sz w:val="19"/>
+              </w:rPr>
+              <w:t>19</w:t>
+            </w:r>
+          </w:p>
+        </w:tc>
+        <w:tc>
+          <w:tcPr>
+            <w:tcW w:type="dxa" w:w="1040"/>
+            <w:shd w:val="clear" w:color="auto" w:fill="F2F4F8"/>
+          </w:tcPr>
+          <w:p>
+            <w:r>
+              <w:rPr>
+                <w:sz w:val="19"/>
+              </w:rPr>
+              <w:t>120</w:t>
+            </w:r>
+          </w:p>
+        </w:tc>
+        <w:tc>
+          <w:tcPr>
+            <w:tcW w:type="dxa" w:w="1040"/>
+            <w:shd w:val="clear" w:color="auto" w:fill="F2F4F8"/>
+          </w:tcPr>
+          <w:p>
+            <w:r>
+              <w:rPr>
+                <w:sz w:val="19"/>
+              </w:rPr>
+              <w:t>Overall: 94.2%</w:t>
+            </w:r>
+          </w:p>
+        </w:tc>
+      </w:tr>
+    </w:tbl>
+    <w:p/>
+    <w:p>
+      <w:pPr>
+        <w:pStyle w:val="Heading3"/>
+      </w:pPr>
+      <w:r>
+        <w:rPr>
+          <w:b/>
+          <w:color w:val="595959"/>
+          <w:sz w:val="24"/>
+        </w:rPr>
+        <w:t>Statistical Formulas Used</w:t>
+      </w:r>
+    </w:p>
+    <w:p>
+      <w:pPr>
+        <w:pStyle w:val="ListNumber"/>
+      </w:pPr>
+      <w:r/>
+      <w:r>
+        <w:rPr>
+          <w:b/>
+        </w:rPr>
+        <w:t>Classification Accuracy</w:t>
+      </w:r>
+      <w:r>
+        <w:t>:</w:t>
+      </w:r>
+    </w:p>
+    <w:p>
+      <w:r>
+        <w:t>$$\text{Accuracy} = \frac{\sum \text{True Positives}}{\text{Total Evaluation Trials}} = \frac{19 + 18 + 14 + 24 + 18 + 19}{120} = \frac{113}{120} = 94.17\% \approx \mathbf{94.2\%}$$</w:t>
+      </w:r>
+    </w:p>
+    <w:p>
+      <w:pPr>
+        <w:pStyle w:val="ListNumber"/>
+      </w:pPr>
+      <w:r/>
+      <w:r>
+        <w:rPr>
+          <w:b/>
+        </w:rPr>
+        <w:t>Reading-Speed Calibration Reduction Ratio</w:t>
+      </w:r>
+      <w:r>
+        <w:t>:</w:t>
+      </w:r>
+    </w:p>
+    <w:p>
+      <w:r>
+        <w:t>$$\text{False Positive Reduction} = \frac{\text{Pre-Calibration Misclassifications} - \text{Post-Calibration Misclassifications}}{\text{Pre-Calibration Misclassifications}} = \frac{16 - 2}{16} = \mathbf{87.5\%}$$</w:t>
+      </w:r>
+    </w:p>
+    <w:p>
+      <w:pPr>
         <w:pStyle w:val="Heading1"/>
       </w:pPr>
       <w:r>
@@ -6571,6 +7872,180 @@
       </w:pPr>
       <w:r>
         <w:t>Valid OpenAI or OpenRouter API key configured in `.env`.</w:t>
+      </w:r>
+    </w:p>
+    <w:p>
+      <w:pPr>
+        <w:pStyle w:val="Heading2"/>
+      </w:pPr>
+      <w:r>
+        <w:rPr>
+          <w:b/>
+          <w:color w:val="2E75B6"/>
+          <w:sz w:val="28"/>
+        </w:rPr>
+        <w:t>12.3 Privacy &amp; Ethical AI Documentation</w:t>
+      </w:r>
+    </w:p>
+    <w:p>
+      <w:r>
+        <w:t>The AITA platform processes sensitive user data, including personal credentials, assessment responses, behavioral interaction telemetry, and AI-generated cognitive classifications. To ensure ethical compliance and user trust, the platform enforces five fundamental principles:</w:t>
+      </w:r>
+    </w:p>
+    <w:p>
+      <w:pPr>
+        <w:pStyle w:val="ListNumber"/>
+      </w:pPr>
+      <w:r/>
+      <w:r>
+        <w:rPr>
+          <w:b/>
+        </w:rPr>
+        <w:t>Data Minimization &amp; Confidentiality</w:t>
+      </w:r>
+      <w:r>
+        <w:t>:</w:t>
+      </w:r>
+    </w:p>
+    <w:p>
+      <w:pPr>
+        <w:pStyle w:val="ListBullet"/>
+      </w:pPr>
+      <w:r>
+        <w:t>Telemetry tracking is restricted strictly to active assessment windows. No background activity, webcam feeds, or external browser interactions are monitored outside active test containers.</w:t>
+      </w:r>
+    </w:p>
+    <w:p>
+      <w:pPr>
+        <w:pStyle w:val="ListBullet"/>
+      </w:pPr>
+      <w:r>
+        <w:t>User passwords are encrypted using PBKDF2 hashing before database persistence.</w:t>
+      </w:r>
+    </w:p>
+    <w:p>
+      <w:pPr>
+        <w:pStyle w:val="ListNumber"/>
+      </w:pPr>
+      <w:r/>
+      <w:r>
+        <w:rPr>
+          <w:b/>
+        </w:rPr>
+        <w:t>Role-Based Access Control (RBAC)</w:t>
+      </w:r>
+      <w:r>
+        <w:t>:</w:t>
+      </w:r>
+    </w:p>
+    <w:p>
+      <w:pPr>
+        <w:pStyle w:val="ListBullet"/>
+      </w:pPr>
+      <w:r>
+        <w:t>Student test records and individual item responses are accessible only to the authenticated student and the authorized course host/teacher via authenticated Prisma JWT session tokens.</w:t>
+      </w:r>
+    </w:p>
+    <w:p>
+      <w:pPr>
+        <w:pStyle w:val="ListBullet"/>
+      </w:pPr>
+      <w:r>
+        <w:t>Personal dashboard deletions utilize user-scoped client keys (`aita_hidden_items_v1_[userId]`), preventing accidental data loss while protecting student privacy.</w:t>
+      </w:r>
+    </w:p>
+    <w:p>
+      <w:pPr>
+        <w:pStyle w:val="ListNumber"/>
+      </w:pPr>
+      <w:r/>
+      <w:r>
+        <w:rPr>
+          <w:b/>
+        </w:rPr>
+        <w:t>Non-Discriminatory Diagnostic Mandate</w:t>
+      </w:r>
+      <w:r>
+        <w:t>:</w:t>
+      </w:r>
+    </w:p>
+    <w:p>
+      <w:pPr>
+        <w:pStyle w:val="ListBullet"/>
+      </w:pPr>
+      <w:r>
+        <w:t xml:space="preserve">Behavioral archetypes (e.g., *Quick but Careless*, *Slow but Thorough*) are explicitly designed as </w:t>
+      </w:r>
+      <w:r>
+        <w:rPr>
+          <w:b/>
+        </w:rPr>
+        <w:t>formative growth indicators</w:t>
+      </w:r>
+      <w:r>
+        <w:t>, not permanent or punitive academic labels.</w:t>
+      </w:r>
+    </w:p>
+    <w:p>
+      <w:pPr>
+        <w:pStyle w:val="ListBullet"/>
+      </w:pPr>
+      <w:r>
+        <w:t>Categories provide constructive learning strategy recommendations (e.g., double-checking prompts, structured pacing exercises) rather than restricting course access or lowering academic grades.</w:t>
+      </w:r>
+    </w:p>
+    <w:p>
+      <w:pPr>
+        <w:pStyle w:val="ListNumber"/>
+      </w:pPr>
+      <w:r/>
+      <w:r>
+        <w:rPr>
+          <w:b/>
+        </w:rPr>
+        <w:t>AI Transparency &amp; Explainability</w:t>
+      </w:r>
+      <w:r>
+        <w:t>:</w:t>
+      </w:r>
+    </w:p>
+    <w:p>
+      <w:pPr>
+        <w:pStyle w:val="ListBullet"/>
+      </w:pPr>
+      <w:r>
+        <w:t>All AI Advisor chatbot explanations reference concrete, verifiable question items, student selections, and grading rubrics.</w:t>
+      </w:r>
+    </w:p>
+    <w:p>
+      <w:pPr>
+        <w:pStyle w:val="ListBullet"/>
+      </w:pPr>
+      <w:r>
+        <w:t>Users are explicitly informed when AI vision OCR or open-ended reflection parsing is active.</w:t>
+      </w:r>
+    </w:p>
+    <w:p>
+      <w:pPr>
+        <w:pStyle w:val="ListNumber"/>
+      </w:pPr>
+      <w:r/>
+      <w:r>
+        <w:rPr>
+          <w:b/>
+        </w:rPr>
+        <w:t>Fairness &amp; Speed Normalization</w:t>
+      </w:r>
+      <w:r>
+        <w:t>:</w:t>
+      </w:r>
+    </w:p>
+    <w:p>
+      <w:pPr>
+        <w:pStyle w:val="ListBullet"/>
+      </w:pPr>
+      <w:r>
+        <w:t>The 10-second calibration baseline ensures that slow readers or neurodivergent students are not unfairly penalized by static time thresholds, upholding algorithmic fairness across diverse student populations.</w:t>
       </w:r>
     </w:p>
     <w:sectPr>

</xml_diff>